<commit_message>
fix(source-viewer): md highlight paints (rendered-needle match + head-scoped style); valid Chromium-built PDF fixtures + Thai/Sarabun coverage
</commit_message>
<xml_diff>
--- a/test-fixtures/source-viewer/simple.docx
+++ b/test-fixtures/source-viewer/simple.docx
@@ -7,17 +7,38 @@
         <w:pStyle w:val="Heading1"/>
       </w:pPr>
       <w:r>
-        <w:t>Test Document</w:t>
+        <w:rPr>
+          <w:rFonts w:ascii="TH SarabunNew" w:hAnsi="TH SarabunNew" w:cs="TH SarabunNew"/>
+          <w:szCs w:val="32"/>
+        </w:rPr>
+        <w:t xml:space="preserve">Test Document</w:t>
       </w:r>
     </w:p>
     <w:p>
       <w:r>
-        <w:t>The quick brown fox anchors here.</w:t>
+        <w:rPr>
+          <w:rFonts w:ascii="TH SarabunNew" w:hAnsi="TH SarabunNew" w:cs="TH SarabunNew"/>
+          <w:szCs w:val="32"/>
+        </w:rPr>
+        <w:t xml:space="preserve">The quick brown fox anchors here.</w:t>
       </w:r>
     </w:p>
     <w:p>
       <w:r>
-        <w:t>This is a test paragraph.</w:t>
+        <w:rPr>
+          <w:rFonts w:ascii="TH SarabunNew" w:hAnsi="TH SarabunNew" w:cs="TH SarabunNew"/>
+          <w:szCs w:val="32"/>
+        </w:rPr>
+        <w:t xml:space="preserve">This is a test paragraph.</w:t>
+      </w:r>
+    </w:p>
+    <w:p>
+      <w:r>
+        <w:rPr>
+          <w:rFonts w:ascii="TH SarabunNew" w:hAnsi="TH SarabunNew" w:cs="TH SarabunNew"/>
+          <w:szCs w:val="32"/>
+        </w:rPr>
+        <w:t xml:space="preserve">การทดสอบระบบค้นหาข้อความภาษาไทย</w:t>
       </w:r>
     </w:p>
     <w:tbl>
@@ -28,14 +49,22 @@
         <w:tc>
           <w:p>
             <w:r>
-              <w:t>Cell 1</w:t>
+              <w:rPr>
+                <w:rFonts w:ascii="TH SarabunNew" w:hAnsi="TH SarabunNew" w:cs="TH SarabunNew"/>
+                <w:szCs w:val="32"/>
+              </w:rPr>
+              <w:t xml:space="preserve">Cell 1</w:t>
             </w:r>
           </w:p>
         </w:tc>
         <w:tc>
           <w:p>
             <w:r>
-              <w:t>Cell 2</w:t>
+              <w:rPr>
+                <w:rFonts w:ascii="TH SarabunNew" w:hAnsi="TH SarabunNew" w:cs="TH SarabunNew"/>
+                <w:szCs w:val="32"/>
+              </w:rPr>
+              <w:t xml:space="preserve">Cell 2</w:t>
             </w:r>
           </w:p>
         </w:tc>
@@ -44,14 +73,22 @@
         <w:tc>
           <w:p>
             <w:r>
-              <w:t>Cell 3</w:t>
+              <w:rPr>
+                <w:rFonts w:ascii="TH SarabunNew" w:hAnsi="TH SarabunNew" w:cs="TH SarabunNew"/>
+                <w:szCs w:val="32"/>
+              </w:rPr>
+              <w:t xml:space="preserve">Cell 3</w:t>
             </w:r>
           </w:p>
         </w:tc>
         <w:tc>
           <w:p>
             <w:r>
-              <w:t>Cell 4</w:t>
+              <w:rPr>
+                <w:rFonts w:ascii="TH SarabunNew" w:hAnsi="TH SarabunNew" w:cs="TH SarabunNew"/>
+                <w:szCs w:val="32"/>
+              </w:rPr>
+              <w:t xml:space="preserve">Cell 4</w:t>
             </w:r>
           </w:p>
         </w:tc>
@@ -59,4 +96,18 @@
     </w:tbl>
   </w:body>
 </w:document>
+</file>
+
+<file path=word/styles.xml><?xml version="1.0" encoding="utf-8"?>
+<w:styles xmlns:w="http://schemas.openxmlformats.org/wordprocessingml/2006/main">
+  <w:docDefaults>
+    <w:rPrDefault>
+      <w:rPr>
+        <w:rFonts w:ascii="TH SarabunNew" w:hAnsi="TH SarabunNew" w:cs="TH SarabunNew"/>
+        <w:sz w:val="28"/>
+        <w:szCs w:val="32"/>
+      </w:rPr>
+    </w:rPrDefault>
+  </w:docDefaults>
+</w:styles>
 </file>
</xml_diff>